<commit_message>
docs: complete branding consolidation of docs, README, and iitpave installation guide
</commit_message>
<xml_diff>
--- a/release/RoadX_v2.2_Professional/Sample_DPR_Report.docx
+++ b/release/RoadX_v2.2_Professional/Sample_DPR_Report.docx
@@ -6861,7 +6861,7 @@
                 <w:b w:val="0"/>
                 <w:sz w:val="20"/>
               </w:rPr>
-              <w:t>29-Jun-2026 07:26:50</w:t>
+              <w:t>29-Jun-2026 08:07:22</w:t>
             </w:r>
           </w:p>
         </w:tc>
@@ -18679,7 +18679,7 @@
                 <w:b w:val="0"/>
                 <w:sz w:val="20"/>
               </w:rPr>
-              <w:t>2026-06-29 12:56:50</w:t>
+              <w:t>2026-06-29 13:37:22</w:t>
             </w:r>
           </w:p>
         </w:tc>
@@ -20870,7 +20870,7 @@
                 <w:b w:val="0"/>
                 <w:sz w:val="20"/>
               </w:rPr>
-              <w:t>2026-06-29 12:56:50</w:t>
+              <w:t>2026-06-29 13:37:22</w:t>
             </w:r>
           </w:p>
         </w:tc>

</xml_diff>

<commit_message>
chore: P7C release gate fixes, smoke suite assertions, fallback mock validation refused handling, and compiled RoadX.exe
</commit_message>
<xml_diff>
--- a/release/RoadX_v2.2_Professional/Sample_DPR_Report.docx
+++ b/release/RoadX_v2.2_Professional/Sample_DPR_Report.docx
@@ -1792,7 +1792,7 @@
                 <w:b w:val="0"/>
                 <w:sz w:val="20"/>
               </w:rPr>
-              <w:t>90/100 (Needs Engineer Review)</w:t>
+              <w:t>60/100 (Not Ready)</w:t>
             </w:r>
           </w:p>
         </w:tc>
@@ -1863,7 +1863,7 @@
           <w:i w:val="0"/>
           <w:sz w:val="22"/>
         </w:rPr>
-        <w:t>This professional pavement design report presents the mechanistic and empirical design parameters established for the work 'NH-48 Flexible Pavement Preset'. The evaluation incorporates design traffic analysis, subgrade pavement layer profiling, and mechanistic safety screening. A conventional flexible pavement design has been developed for a design traffic of 183.30 MSA, resulting in a total pavement thickness of 710 mm. A cement-stabilized design (CTB/CTS) has been analyzed as an alternative to achieve structural thickness optimization. Mechanistic verification has been successfully conducted using IITPAVE as a Mechanistically Verified Design.</w:t>
+        <w:t>This professional pavement design report presents the mechanistic and empirical design parameters established for the work 'NH-48 Flexible Pavement Preset'. The evaluation incorporates design traffic analysis, subgrade pavement layer profiling, and mechanistic safety screening. A conventional flexible pavement design has been developed for a design traffic of 183.30 MSA, resulting in a total pavement thickness of 710 mm. A cement-stabilized design (CTB/CTS) has been analyzed as an alternative to achieve structural thickness optimization. The design calculations have been prepared under IRC Catalogue Design (Decision Support Mode) guidelines.</w:t>
       </w:r>
     </w:p>
     <w:p>
@@ -6861,7 +6861,7 @@
                 <w:b w:val="0"/>
                 <w:sz w:val="20"/>
               </w:rPr>
-              <w:t>29-Jun-2026 08:07:22</w:t>
+              <w:t>29-Jun-2026 08:50:11</w:t>
             </w:r>
           </w:p>
         </w:tc>
@@ -7441,7 +7441,7 @@
           <w:color w:val="8A5A00"/>
           <w:sz w:val="20"/>
         </w:rPr>
-        <w:t>[PRELIMINARY] Mechanistic verification was not executed because a licensed IITPAVE installation was unavailable.</w:t>
+        <w:t>WARNING: Mechanistic verification was not executed because a licensed IITPAVE installation was unavailable.</w:t>
       </w:r>
     </w:p>
     <w:p>
@@ -7549,7 +7549,7 @@
                 <w:b w:val="0"/>
                 <w:sz w:val="20"/>
               </w:rPr>
-              <w:t>Yes</w:t>
+              <w:t>No</w:t>
             </w:r>
           </w:p>
         </w:tc>
@@ -7629,7 +7629,7 @@
                 <w:b w:val="0"/>
                 <w:sz w:val="20"/>
               </w:rPr>
-              <w:t>PASS</w:t>
+              <w:t>—</w:t>
             </w:r>
           </w:p>
         </w:tc>
@@ -7669,7 +7669,7 @@
                 <w:b w:val="0"/>
                 <w:sz w:val="20"/>
               </w:rPr>
-              <w:t>PASS</w:t>
+              <w:t>—</w:t>
             </w:r>
           </w:p>
         </w:tc>
@@ -7709,7 +7709,7 @@
                 <w:b w:val="0"/>
                 <w:sz w:val="20"/>
               </w:rPr>
-              <w:t>250.00</w:t>
+              <w:t>—</w:t>
             </w:r>
           </w:p>
         </w:tc>
@@ -7749,7 +7749,7 @@
                 <w:b w:val="0"/>
                 <w:sz w:val="20"/>
               </w:rPr>
-              <w:t>300.00</w:t>
+              <w:t>—</w:t>
             </w:r>
           </w:p>
         </w:tc>
@@ -8114,7 +8114,7 @@
                 <w:b w:val="0"/>
                 <w:sz w:val="20"/>
               </w:rPr>
-              <w:t>PASS</w:t>
+              <w:t>—</w:t>
             </w:r>
           </w:p>
         </w:tc>
@@ -8566,6 +8566,19 @@
         </w:tc>
       </w:tr>
     </w:tbl>
+    <w:p>
+      <w:pPr>
+        <w:jc w:val="left"/>
+      </w:pPr>
+      <w:r>
+        <w:rPr>
+          <w:b/>
+          <w:color w:val="8A5A00"/>
+          <w:sz w:val="20"/>
+        </w:rPr>
+        <w:t>[BLOCKED — fatigue] Mechanistic verification was not executed because a licensed IITPAVE installation was unavailable.</w:t>
+      </w:r>
+    </w:p>
     <w:p>
       <w:pPr>
         <w:spacing w:before="40" w:after="120"/>
@@ -8820,7 +8833,7 @@
                 <w:b w:val="0"/>
                 <w:sz w:val="20"/>
               </w:rPr>
-              <w:t>PASS</w:t>
+              <w:t>—</w:t>
             </w:r>
           </w:p>
         </w:tc>
@@ -9213,6 +9226,19 @@
         </w:tc>
       </w:tr>
     </w:tbl>
+    <w:p>
+      <w:pPr>
+        <w:jc w:val="left"/>
+      </w:pPr>
+      <w:r>
+        <w:rPr>
+          <w:b/>
+          <w:color w:val="8A5A00"/>
+          <w:sz w:val="20"/>
+        </w:rPr>
+        <w:t>[BLOCKED — rutting] Mechanistic verification was not executed because a licensed IITPAVE installation was unavailable.</w:t>
+      </w:r>
+    </w:p>
     <w:p>
       <w:pPr>
         <w:spacing w:before="40" w:after="120"/>
@@ -12410,7 +12436,7 @@
                 <w:b w:val="0"/>
                 <w:sz w:val="20"/>
               </w:rPr>
-              <w:t>★ Mechanistic Verified Mode ★</w:t>
+              <w:t>★ Decision Support Mode ★</w:t>
             </w:r>
           </w:p>
         </w:tc>
@@ -14413,7 +14439,7 @@
                 <w:b w:val="0"/>
                 <w:sz w:val="20"/>
               </w:rPr>
-              <w:t>95</w:t>
+              <w:t>50</w:t>
             </w:r>
           </w:p>
         </w:tc>
@@ -14432,7 +14458,7 @@
                 <w:b w:val="0"/>
                 <w:sz w:val="20"/>
               </w:rPr>
-              <w:t>Fatigue: PASS, Rutting: PASS</w:t>
+              <w:t>Fatigue: FAIL, Rutting: FAIL</w:t>
             </w:r>
           </w:p>
         </w:tc>
@@ -14451,7 +14477,7 @@
                 <w:b w:val="0"/>
                 <w:sz w:val="20"/>
               </w:rPr>
-              <w:t>Mechanistically validated with IITPAVE; structural safety confirmed.</w:t>
+              <w:t>Mechanistic validation failed to satisfy strain limits.</w:t>
             </w:r>
           </w:p>
         </w:tc>
@@ -14548,7 +14574,7 @@
                 <w:b w:val="0"/>
                 <w:sz w:val="20"/>
               </w:rPr>
-              <w:t>95</w:t>
+              <w:t>85</w:t>
             </w:r>
           </w:p>
         </w:tc>
@@ -14567,7 +14593,7 @@
                 <w:b w:val="0"/>
                 <w:sz w:val="20"/>
               </w:rPr>
-              <w:t>Fatigue: PASS, Rutting: PASS</w:t>
+              <w:t>Not Run</w:t>
             </w:r>
           </w:p>
         </w:tc>
@@ -14586,7 +14612,7 @@
                 <w:b w:val="0"/>
                 <w:sz w:val="20"/>
               </w:rPr>
-              <w:t>IITPAVE verified stabilized design offers maximum aggregate savings and guaranteed fatigue/rutting resistance. (Est. Saving: ₹8.91 Cr / 46.7% compared to Option A - Preliminary Engineer Estimate / Consultant BOQ Estimate)</w:t>
+              <w:t>CTB/CTS alternative reduces granular thickness and material cost while maintaining performance. (Est. Saving: ₹8.91 Cr / 46.7% compared to Option A - Preliminary Engineer Estimate / Consultant BOQ Estimate)</w:t>
             </w:r>
           </w:p>
         </w:tc>
@@ -14630,7 +14656,7 @@
           <w:i w:val="0"/>
           <w:sz w:val="22"/>
         </w:rPr>
-        <w:t>Consultant Recommendation Reason: IITPAVE verified stabilized design offers maximum aggregate savings and guaranteed fatigue/rutting resistance. (Est. Saving: ₹8.91 Cr / 46.7% compared to Option A - Preliminary Engineer Estimate / Consultant BOQ Estimate)</w:t>
+        <w:t>Consultant Recommendation Reason: CTB/CTS alternative reduces granular thickness and material cost while maintaining performance. (Est. Saving: ₹8.91 Cr / 46.7% compared to Option A - Preliminary Engineer Estimate / Consultant BOQ Estimate)</w:t>
       </w:r>
     </w:p>
     <w:p>
@@ -14655,21 +14681,6 @@
     </w:p>
     <w:p>
       <w:pPr>
-        <w:spacing w:before="160" w:after="80"/>
-        <w:jc w:val="left"/>
-      </w:pPr>
-      <w:r>
-        <w:rPr>
-          <w:rFonts w:ascii="Arial" w:hAnsi="Arial"/>
-          <w:b/>
-          <w:color w:val="1F3A68"/>
-          <w:sz w:val="24"/>
-        </w:rPr>
-        <w:t>Mechanistic Validation Outcomes</w:t>
-      </w:r>
-    </w:p>
-    <w:p>
-      <w:pPr>
         <w:jc w:val="left"/>
       </w:pPr>
       <w:r>
@@ -14679,756 +14690,7 @@
           <w:i w:val="0"/>
           <w:sz w:val="22"/>
         </w:rPr>
-        <w:t>The designed pavement layer composition has been validated using the linear elastic analysis program IITPAVE.</w:t>
-      </w:r>
-    </w:p>
-    <w:tbl>
-      <w:tblPr>
-        <w:tblStyle w:val="TableGrid"/>
-        <w:tblW w:type="auto" w:w="0"/>
-        <w:jc w:val="center"/>
-        <w:tblLook w:firstColumn="1" w:firstRow="1" w:lastColumn="0" w:lastRow="0" w:noHBand="0" w:noVBand="1" w:val="04A0"/>
-      </w:tblPr>
-      <w:tblGrid>
-        <w:gridCol w:w="4801"/>
-        <w:gridCol w:w="4801"/>
-      </w:tblGrid>
-      <w:tr>
-        <w:tc>
-          <w:tcPr>
-            <w:tcW w:type="dxa" w:w="4801"/>
-            <w:shd w:val="clear" w:color="auto" w:fill="1F3A68"/>
-            <w:vAlign w:val="center"/>
-          </w:tcPr>
-          <w:p>
-            <w:pPr>
-              <w:jc w:val="center"/>
-            </w:pPr>
-            <w:r>
-              <w:rPr>
-                <w:rFonts w:ascii="Arial" w:hAnsi="Arial"/>
-                <w:b/>
-                <w:color w:val="FFFFFF"/>
-                <w:sz w:val="20"/>
-              </w:rPr>
-              <w:t>Verification Metric</w:t>
-            </w:r>
-          </w:p>
-        </w:tc>
-        <w:tc>
-          <w:tcPr>
-            <w:tcW w:type="dxa" w:w="4801"/>
-            <w:shd w:val="clear" w:color="auto" w:fill="1F3A68"/>
-            <w:vAlign w:val="center"/>
-          </w:tcPr>
-          <w:p>
-            <w:pPr>
-              <w:jc w:val="center"/>
-            </w:pPr>
-            <w:r>
-              <w:rPr>
-                <w:rFonts w:ascii="Arial" w:hAnsi="Arial"/>
-                <w:b/>
-                <w:color w:val="FFFFFF"/>
-                <w:sz w:val="20"/>
-              </w:rPr>
-              <w:t>Value / Verdict</w:t>
-            </w:r>
-          </w:p>
-        </w:tc>
-      </w:tr>
-      <w:tr>
-        <w:tc>
-          <w:tcPr>
-            <w:tcW w:type="dxa" w:w="4801"/>
-            <w:vAlign w:val="center"/>
-          </w:tcPr>
-          <w:p>
-            <w:pPr>
-              <w:jc w:val="left"/>
-            </w:pPr>
-            <w:r>
-              <w:rPr>
-                <w:rFonts w:ascii="Arial" w:hAnsi="Arial"/>
-                <w:b w:val="0"/>
-                <w:sz w:val="20"/>
-              </w:rPr>
-              <w:t>Fatigue Life (MSA)</w:t>
-            </w:r>
-          </w:p>
-        </w:tc>
-        <w:tc>
-          <w:tcPr>
-            <w:tcW w:type="dxa" w:w="4801"/>
-            <w:vAlign w:val="center"/>
-          </w:tcPr>
-          <w:p>
-            <w:pPr>
-              <w:jc w:val="center"/>
-            </w:pPr>
-            <w:r>
-              <w:rPr>
-                <w:rFonts w:ascii="Arial" w:hAnsi="Arial"/>
-                <w:b w:val="0"/>
-                <w:sz w:val="20"/>
-              </w:rPr>
-              <w:t>250.00</w:t>
-            </w:r>
-          </w:p>
-        </w:tc>
-      </w:tr>
-      <w:tr>
-        <w:tc>
-          <w:tcPr>
-            <w:tcW w:type="dxa" w:w="4801"/>
-            <w:vAlign w:val="center"/>
-          </w:tcPr>
-          <w:p>
-            <w:pPr>
-              <w:jc w:val="left"/>
-            </w:pPr>
-            <w:r>
-              <w:rPr>
-                <w:rFonts w:ascii="Arial" w:hAnsi="Arial"/>
-                <w:b w:val="0"/>
-                <w:sz w:val="20"/>
-              </w:rPr>
-              <w:t>Rutting Life (MSA)</w:t>
-            </w:r>
-          </w:p>
-        </w:tc>
-        <w:tc>
-          <w:tcPr>
-            <w:tcW w:type="dxa" w:w="4801"/>
-            <w:vAlign w:val="center"/>
-          </w:tcPr>
-          <w:p>
-            <w:pPr>
-              <w:jc w:val="center"/>
-            </w:pPr>
-            <w:r>
-              <w:rPr>
-                <w:rFonts w:ascii="Arial" w:hAnsi="Arial"/>
-                <w:b w:val="0"/>
-                <w:sz w:val="20"/>
-              </w:rPr>
-              <w:t>300.00</w:t>
-            </w:r>
-          </w:p>
-        </w:tc>
-      </w:tr>
-      <w:tr>
-        <w:tc>
-          <w:tcPr>
-            <w:tcW w:type="dxa" w:w="4801"/>
-            <w:vAlign w:val="center"/>
-          </w:tcPr>
-          <w:p>
-            <w:pPr>
-              <w:jc w:val="left"/>
-            </w:pPr>
-            <w:r>
-              <w:rPr>
-                <w:rFonts w:ascii="Arial" w:hAnsi="Arial"/>
-                <w:b w:val="0"/>
-                <w:sz w:val="20"/>
-              </w:rPr>
-              <w:t>Design Life (MSA)</w:t>
-            </w:r>
-          </w:p>
-        </w:tc>
-        <w:tc>
-          <w:tcPr>
-            <w:tcW w:type="dxa" w:w="4801"/>
-            <w:vAlign w:val="center"/>
-          </w:tcPr>
-          <w:p>
-            <w:pPr>
-              <w:jc w:val="center"/>
-            </w:pPr>
-            <w:r>
-              <w:rPr>
-                <w:rFonts w:ascii="Arial" w:hAnsi="Arial"/>
-                <w:b w:val="0"/>
-                <w:sz w:val="20"/>
-              </w:rPr>
-              <w:t>183.30</w:t>
-            </w:r>
-          </w:p>
-        </w:tc>
-      </w:tr>
-      <w:tr>
-        <w:tc>
-          <w:tcPr>
-            <w:tcW w:type="dxa" w:w="4801"/>
-            <w:vAlign w:val="center"/>
-          </w:tcPr>
-          <w:p>
-            <w:pPr>
-              <w:jc w:val="left"/>
-            </w:pPr>
-            <w:r>
-              <w:rPr>
-                <w:rFonts w:ascii="Arial" w:hAnsi="Arial"/>
-                <w:b w:val="0"/>
-                <w:sz w:val="20"/>
-              </w:rPr>
-              <w:t>Tensile Strain (Microstrain)</w:t>
-            </w:r>
-          </w:p>
-        </w:tc>
-        <w:tc>
-          <w:tcPr>
-            <w:tcW w:type="dxa" w:w="4801"/>
-            <w:vAlign w:val="center"/>
-          </w:tcPr>
-          <w:p>
-            <w:pPr>
-              <w:jc w:val="center"/>
-            </w:pPr>
-            <w:r>
-              <w:rPr>
-                <w:rFonts w:ascii="Arial" w:hAnsi="Arial"/>
-                <w:b w:val="0"/>
-                <w:sz w:val="20"/>
-              </w:rPr>
-              <w:t>112.5</w:t>
-            </w:r>
-          </w:p>
-        </w:tc>
-      </w:tr>
-      <w:tr>
-        <w:tc>
-          <w:tcPr>
-            <w:tcW w:type="dxa" w:w="4801"/>
-            <w:vAlign w:val="center"/>
-          </w:tcPr>
-          <w:p>
-            <w:pPr>
-              <w:jc w:val="left"/>
-            </w:pPr>
-            <w:r>
-              <w:rPr>
-                <w:rFonts w:ascii="Arial" w:hAnsi="Arial"/>
-                <w:b w:val="0"/>
-                <w:sz w:val="20"/>
-              </w:rPr>
-              <w:t>Compressive Strain (Microstrain)</w:t>
-            </w:r>
-          </w:p>
-        </w:tc>
-        <w:tc>
-          <w:tcPr>
-            <w:tcW w:type="dxa" w:w="4801"/>
-            <w:vAlign w:val="center"/>
-          </w:tcPr>
-          <w:p>
-            <w:pPr>
-              <w:jc w:val="center"/>
-            </w:pPr>
-            <w:r>
-              <w:rPr>
-                <w:rFonts w:ascii="Arial" w:hAnsi="Arial"/>
-                <w:b w:val="0"/>
-                <w:sz w:val="20"/>
-              </w:rPr>
-              <w:t>220.0</w:t>
-            </w:r>
-          </w:p>
-        </w:tc>
-      </w:tr>
-      <w:tr>
-        <w:tc>
-          <w:tcPr>
-            <w:tcW w:type="dxa" w:w="4801"/>
-            <w:vAlign w:val="center"/>
-          </w:tcPr>
-          <w:p>
-            <w:pPr>
-              <w:jc w:val="left"/>
-            </w:pPr>
-            <w:r>
-              <w:rPr>
-                <w:rFonts w:ascii="Arial" w:hAnsi="Arial"/>
-                <w:b w:val="0"/>
-                <w:sz w:val="20"/>
-              </w:rPr>
-              <w:t>Fatigue Check Verdict</w:t>
-            </w:r>
-          </w:p>
-        </w:tc>
-        <w:tc>
-          <w:tcPr>
-            <w:tcW w:type="dxa" w:w="4801"/>
-            <w:vAlign w:val="center"/>
-          </w:tcPr>
-          <w:p>
-            <w:pPr>
-              <w:jc w:val="center"/>
-            </w:pPr>
-            <w:r>
-              <w:rPr>
-                <w:rFonts w:ascii="Arial" w:hAnsi="Arial"/>
-                <w:b w:val="0"/>
-                <w:sz w:val="20"/>
-              </w:rPr>
-              <w:t>PASS</w:t>
-            </w:r>
-          </w:p>
-        </w:tc>
-      </w:tr>
-      <w:tr>
-        <w:tc>
-          <w:tcPr>
-            <w:tcW w:type="dxa" w:w="4801"/>
-            <w:vAlign w:val="center"/>
-          </w:tcPr>
-          <w:p>
-            <w:pPr>
-              <w:jc w:val="left"/>
-            </w:pPr>
-            <w:r>
-              <w:rPr>
-                <w:rFonts w:ascii="Arial" w:hAnsi="Arial"/>
-                <w:b w:val="0"/>
-                <w:sz w:val="20"/>
-              </w:rPr>
-              <w:t>Rutting Check Verdict</w:t>
-            </w:r>
-          </w:p>
-        </w:tc>
-        <w:tc>
-          <w:tcPr>
-            <w:tcW w:type="dxa" w:w="4801"/>
-            <w:vAlign w:val="center"/>
-          </w:tcPr>
-          <w:p>
-            <w:pPr>
-              <w:jc w:val="center"/>
-            </w:pPr>
-            <w:r>
-              <w:rPr>
-                <w:rFonts w:ascii="Arial" w:hAnsi="Arial"/>
-                <w:b w:val="0"/>
-                <w:sz w:val="20"/>
-              </w:rPr>
-              <w:t>PASS</w:t>
-            </w:r>
-          </w:p>
-        </w:tc>
-      </w:tr>
-    </w:tbl>
-    <w:p>
-      <w:pPr>
-        <w:jc w:val="left"/>
-      </w:pPr>
-      <w:r>
-        <w:rPr>
-          <w:rFonts w:ascii="Arial" w:hAnsi="Arial"/>
-          <w:b w:val="0"/>
-          <w:i w:val="0"/>
-          <w:sz w:val="22"/>
-        </w:rPr>
-      </w:r>
-    </w:p>
-    <w:p>
-      <w:pPr>
-        <w:spacing w:before="160" w:after="80"/>
-        <w:jc w:val="left"/>
-      </w:pPr>
-      <w:r>
-        <w:rPr>
-          <w:rFonts w:ascii="Arial" w:hAnsi="Arial"/>
-          <w:b/>
-          <w:sz w:val="22"/>
-        </w:rPr>
-        <w:t>Calculation Traceability — IITPAVE Mechanistic Safety Verification</w:t>
-      </w:r>
-    </w:p>
-    <w:tbl>
-      <w:tblPr>
-        <w:tblStyle w:val="TableGrid"/>
-        <w:tblW w:type="auto" w:w="0"/>
-        <w:jc w:val="center"/>
-        <w:tblLook w:firstColumn="1" w:firstRow="1" w:lastColumn="0" w:lastRow="0" w:noHBand="0" w:noVBand="1" w:val="04A0"/>
-      </w:tblPr>
-      <w:tblGrid>
-        <w:gridCol w:w="3201"/>
-        <w:gridCol w:w="3201"/>
-        <w:gridCol w:w="3201"/>
-      </w:tblGrid>
-      <w:tr>
-        <w:tc>
-          <w:tcPr>
-            <w:tcW w:type="dxa" w:w="3201"/>
-            <w:shd w:val="clear" w:color="auto" w:fill="1F3A68"/>
-            <w:vAlign w:val="center"/>
-          </w:tcPr>
-          <w:p>
-            <w:pPr>
-              <w:jc w:val="center"/>
-            </w:pPr>
-            <w:r>
-              <w:rPr>
-                <w:rFonts w:ascii="Arial" w:hAnsi="Arial"/>
-                <w:b/>
-                <w:color w:val="FFFFFF"/>
-                <w:sz w:val="20"/>
-              </w:rPr>
-              <w:t>Traceability Parameter</w:t>
-            </w:r>
-          </w:p>
-        </w:tc>
-        <w:tc>
-          <w:tcPr>
-            <w:tcW w:type="dxa" w:w="3201"/>
-            <w:shd w:val="clear" w:color="auto" w:fill="1F3A68"/>
-            <w:vAlign w:val="center"/>
-          </w:tcPr>
-          <w:p>
-            <w:pPr>
-              <w:jc w:val="center"/>
-            </w:pPr>
-            <w:r>
-              <w:rPr>
-                <w:rFonts w:ascii="Arial" w:hAnsi="Arial"/>
-                <w:b/>
-                <w:color w:val="FFFFFF"/>
-                <w:sz w:val="20"/>
-              </w:rPr>
-              <w:t>Property Name</w:t>
-            </w:r>
-          </w:p>
-        </w:tc>
-        <w:tc>
-          <w:tcPr>
-            <w:tcW w:type="dxa" w:w="3201"/>
-            <w:shd w:val="clear" w:color="auto" w:fill="1F3A68"/>
-            <w:vAlign w:val="center"/>
-          </w:tcPr>
-          <w:p>
-            <w:pPr>
-              <w:jc w:val="center"/>
-            </w:pPr>
-            <w:r>
-              <w:rPr>
-                <w:rFonts w:ascii="Arial" w:hAnsi="Arial"/>
-                <w:b/>
-                <w:color w:val="FFFFFF"/>
-                <w:sz w:val="20"/>
-              </w:rPr>
-              <w:t>Value</w:t>
-            </w:r>
-          </w:p>
-        </w:tc>
-      </w:tr>
-      <w:tr>
-        <w:tc>
-          <w:tcPr>
-            <w:tcW w:type="dxa" w:w="3201"/>
-            <w:vAlign w:val="center"/>
-          </w:tcPr>
-          <w:p>
-            <w:pPr>
-              <w:jc w:val="left"/>
-            </w:pPr>
-            <w:r>
-              <w:rPr>
-                <w:rFonts w:ascii="Arial" w:hAnsi="Arial"/>
-                <w:b w:val="0"/>
-                <w:sz w:val="20"/>
-              </w:rPr>
-              <w:t>Input Source Data</w:t>
-            </w:r>
-          </w:p>
-        </w:tc>
-        <w:tc>
-          <w:tcPr>
-            <w:tcW w:type="dxa" w:w="3201"/>
-            <w:vAlign w:val="center"/>
-          </w:tcPr>
-          <w:p>
-            <w:pPr>
-              <w:jc w:val="center"/>
-            </w:pPr>
-            <w:r>
-              <w:rPr>
-                <w:rFonts w:ascii="Arial" w:hAnsi="Arial"/>
-                <w:b w:val="0"/>
-                <w:sz w:val="20"/>
-              </w:rPr>
-              <w:t>Design Traffic</w:t>
-            </w:r>
-          </w:p>
-        </w:tc>
-        <w:tc>
-          <w:tcPr>
-            <w:tcW w:type="dxa" w:w="3201"/>
-            <w:vAlign w:val="center"/>
-          </w:tcPr>
-          <w:p>
-            <w:pPr>
-              <w:jc w:val="center"/>
-            </w:pPr>
-            <w:r>
-              <w:rPr>
-                <w:rFonts w:ascii="Arial" w:hAnsi="Arial"/>
-                <w:b w:val="0"/>
-                <w:sz w:val="20"/>
-              </w:rPr>
-              <w:t>183.29904994723063 MSA</w:t>
-            </w:r>
-          </w:p>
-        </w:tc>
-      </w:tr>
-      <w:tr>
-        <w:tc>
-          <w:tcPr>
-            <w:tcW w:type="dxa" w:w="3201"/>
-            <w:vAlign w:val="center"/>
-          </w:tcPr>
-          <w:p>
-            <w:pPr>
-              <w:jc w:val="left"/>
-            </w:pPr>
-            <w:r>
-              <w:rPr>
-                <w:rFonts w:ascii="Arial" w:hAnsi="Arial"/>
-                <w:b w:val="0"/>
-                <w:sz w:val="20"/>
-              </w:rPr>
-              <w:t>Input Source Data</w:t>
-            </w:r>
-          </w:p>
-        </w:tc>
-        <w:tc>
-          <w:tcPr>
-            <w:tcW w:type="dxa" w:w="3201"/>
-            <w:vAlign w:val="center"/>
-          </w:tcPr>
-          <w:p>
-            <w:pPr>
-              <w:jc w:val="center"/>
-            </w:pPr>
-            <w:r>
-              <w:rPr>
-                <w:rFonts w:ascii="Arial" w:hAnsi="Arial"/>
-                <w:b w:val="0"/>
-                <w:sz w:val="20"/>
-              </w:rPr>
-              <w:t>Subgrade Mr</w:t>
-            </w:r>
-          </w:p>
-        </w:tc>
-        <w:tc>
-          <w:tcPr>
-            <w:tcW w:type="dxa" w:w="3201"/>
-            <w:vAlign w:val="center"/>
-          </w:tcPr>
-          <w:p>
-            <w:pPr>
-              <w:jc w:val="center"/>
-            </w:pPr>
-            <w:r>
-              <w:rPr>
-                <w:rFonts w:ascii="Arial" w:hAnsi="Arial"/>
-                <w:b w:val="0"/>
-                <w:sz w:val="20"/>
-              </w:rPr>
-              <w:t>55.4 MPa</w:t>
-            </w:r>
-          </w:p>
-        </w:tc>
-      </w:tr>
-      <w:tr>
-        <w:tc>
-          <w:tcPr>
-            <w:tcW w:type="dxa" w:w="3201"/>
-            <w:vAlign w:val="center"/>
-          </w:tcPr>
-          <w:p>
-            <w:pPr>
-              <w:jc w:val="left"/>
-            </w:pPr>
-            <w:r>
-              <w:rPr>
-                <w:rFonts w:ascii="Arial" w:hAnsi="Arial"/>
-                <w:b w:val="0"/>
-                <w:sz w:val="20"/>
-              </w:rPr>
-              <w:t>Calculation Result</w:t>
-            </w:r>
-          </w:p>
-        </w:tc>
-        <w:tc>
-          <w:tcPr>
-            <w:tcW w:type="dxa" w:w="3201"/>
-            <w:vAlign w:val="center"/>
-          </w:tcPr>
-          <w:p>
-            <w:pPr>
-              <w:jc w:val="center"/>
-            </w:pPr>
-            <w:r>
-              <w:rPr>
-                <w:rFonts w:ascii="Arial" w:hAnsi="Arial"/>
-                <w:b w:val="0"/>
-                <w:sz w:val="20"/>
-              </w:rPr>
-              <w:t>Fatigue Life</w:t>
-            </w:r>
-          </w:p>
-        </w:tc>
-        <w:tc>
-          <w:tcPr>
-            <w:tcW w:type="dxa" w:w="3201"/>
-            <w:vAlign w:val="center"/>
-          </w:tcPr>
-          <w:p>
-            <w:pPr>
-              <w:jc w:val="center"/>
-            </w:pPr>
-            <w:r>
-              <w:rPr>
-                <w:rFonts w:ascii="Arial" w:hAnsi="Arial"/>
-                <w:b w:val="0"/>
-                <w:sz w:val="20"/>
-              </w:rPr>
-              <w:t>250.00 MSA</w:t>
-            </w:r>
-          </w:p>
-        </w:tc>
-      </w:tr>
-      <w:tr>
-        <w:tc>
-          <w:tcPr>
-            <w:tcW w:type="dxa" w:w="3201"/>
-            <w:vAlign w:val="center"/>
-          </w:tcPr>
-          <w:p>
-            <w:pPr>
-              <w:jc w:val="left"/>
-            </w:pPr>
-            <w:r>
-              <w:rPr>
-                <w:rFonts w:ascii="Arial" w:hAnsi="Arial"/>
-                <w:b w:val="0"/>
-                <w:sz w:val="20"/>
-              </w:rPr>
-              <w:t>Calculation Result</w:t>
-            </w:r>
-          </w:p>
-        </w:tc>
-        <w:tc>
-          <w:tcPr>
-            <w:tcW w:type="dxa" w:w="3201"/>
-            <w:vAlign w:val="center"/>
-          </w:tcPr>
-          <w:p>
-            <w:pPr>
-              <w:jc w:val="center"/>
-            </w:pPr>
-            <w:r>
-              <w:rPr>
-                <w:rFonts w:ascii="Arial" w:hAnsi="Arial"/>
-                <w:b w:val="0"/>
-                <w:sz w:val="20"/>
-              </w:rPr>
-              <w:t>Rutting Life</w:t>
-            </w:r>
-          </w:p>
-        </w:tc>
-        <w:tc>
-          <w:tcPr>
-            <w:tcW w:type="dxa" w:w="3201"/>
-            <w:vAlign w:val="center"/>
-          </w:tcPr>
-          <w:p>
-            <w:pPr>
-              <w:jc w:val="center"/>
-            </w:pPr>
-            <w:r>
-              <w:rPr>
-                <w:rFonts w:ascii="Arial" w:hAnsi="Arial"/>
-                <w:b w:val="0"/>
-                <w:sz w:val="20"/>
-              </w:rPr>
-              <w:t>300.00 MSA</w:t>
-            </w:r>
-          </w:p>
-        </w:tc>
-      </w:tr>
-      <w:tr>
-        <w:tc>
-          <w:tcPr>
-            <w:tcW w:type="dxa" w:w="3201"/>
-            <w:vAlign w:val="center"/>
-          </w:tcPr>
-          <w:p>
-            <w:pPr>
-              <w:jc w:val="left"/>
-            </w:pPr>
-            <w:r>
-              <w:rPr>
-                <w:rFonts w:ascii="Arial" w:hAnsi="Arial"/>
-                <w:b w:val="0"/>
-                <w:sz w:val="20"/>
-              </w:rPr>
-              <w:t>Reference Standard</w:t>
-            </w:r>
-          </w:p>
-        </w:tc>
-        <w:tc>
-          <w:tcPr>
-            <w:tcW w:type="dxa" w:w="3201"/>
-            <w:vAlign w:val="center"/>
-          </w:tcPr>
-          <w:p>
-            <w:pPr>
-              <w:jc w:val="center"/>
-            </w:pPr>
-            <w:r>
-              <w:rPr>
-                <w:rFonts w:ascii="Arial" w:hAnsi="Arial"/>
-                <w:b w:val="0"/>
-                <w:sz w:val="20"/>
-              </w:rPr>
-              <w:t>Standard Citation</w:t>
-            </w:r>
-          </w:p>
-        </w:tc>
-        <w:tc>
-          <w:tcPr>
-            <w:tcW w:type="dxa" w:w="3201"/>
-            <w:vAlign w:val="center"/>
-          </w:tcPr>
-          <w:p>
-            <w:pPr>
-              <w:jc w:val="center"/>
-            </w:pPr>
-            <w:r>
-              <w:rPr>
-                <w:rFonts w:ascii="Arial" w:hAnsi="Arial"/>
-                <w:b w:val="0"/>
-                <w:sz w:val="20"/>
-              </w:rPr>
-              <w:t>IRC:37-2018 (Section 6 &amp; IITPAVE Engine)</w:t>
-            </w:r>
-          </w:p>
-        </w:tc>
-      </w:tr>
-    </w:tbl>
-    <w:p>
-      <w:pPr>
-        <w:jc w:val="left"/>
-      </w:pPr>
-      <w:r>
-        <w:rPr>
-          <w:rFonts w:ascii="Arial" w:hAnsi="Arial"/>
-          <w:b w:val="0"/>
-          <w:i w:val="0"/>
-          <w:sz w:val="22"/>
-        </w:rPr>
+        <w:t>Real IITPAVE verification was not performed. Pavement design is prepared under empirical Decision Support Mode guidelines.</w:t>
       </w:r>
     </w:p>
     <w:p>
@@ -18519,7 +17781,7 @@
                 <w:b w:val="0"/>
                 <w:sz w:val="20"/>
               </w:rPr>
-              <w:t>90 / 100</w:t>
+              <w:t>60 / 100</w:t>
             </w:r>
           </w:p>
         </w:tc>
@@ -18559,7 +17821,7 @@
                 <w:b w:val="0"/>
                 <w:sz w:val="20"/>
               </w:rPr>
-              <w:t>YELLOW</w:t>
+              <w:t>RED</w:t>
             </w:r>
           </w:p>
         </w:tc>
@@ -18599,7 +17861,7 @@
                 <w:b w:val="0"/>
                 <w:sz w:val="20"/>
               </w:rPr>
-              <w:t>Needs Engineer Review</w:t>
+              <w:t>Not Ready</w:t>
             </w:r>
           </w:p>
         </w:tc>
@@ -18639,7 +17901,7 @@
                 <w:b w:val="0"/>
                 <w:sz w:val="20"/>
               </w:rPr>
-              <w:t>READY AFTER MINOR CORRECTIONS</w:t>
+              <w:t>NOT READY FOR SUBMISSION</w:t>
             </w:r>
           </w:p>
         </w:tc>
@@ -18679,7 +17941,7 @@
                 <w:b w:val="0"/>
                 <w:sz w:val="20"/>
               </w:rPr>
-              <w:t>2026-06-29 13:37:22</w:t>
+              <w:t>2026-06-29 14:20:11</w:t>
             </w:r>
           </w:p>
         </w:tc>
@@ -18943,7 +18205,7 @@
                 <w:b w:val="0"/>
                 <w:sz w:val="20"/>
               </w:rPr>
-              <w:t>100%</w:t>
+              <w:t>0%</w:t>
             </w:r>
           </w:p>
         </w:tc>
@@ -18962,7 +18224,7 @@
                 <w:b w:val="0"/>
                 <w:sz w:val="20"/>
               </w:rPr>
-              <w:t>IITPAVE boundary strains successfully calculated and verify fatigue/rutting structural safety.</w:t>
+              <w:t>Mechanistic verification was not executed because a licensed IITPAVE installation was unavailable.</w:t>
             </w:r>
           </w:p>
         </w:tc>
@@ -20153,6 +19415,200 @@
                 <w:b w:val="0"/>
                 <w:sz w:val="20"/>
               </w:rPr>
+              <w:t>WARNING</w:t>
+            </w:r>
+          </w:p>
+        </w:tc>
+        <w:tc>
+          <w:tcPr>
+            <w:tcW w:type="dxa" w:w="1920"/>
+            <w:vAlign w:val="center"/>
+          </w:tcPr>
+          <w:p>
+            <w:pPr>
+              <w:jc w:val="center"/>
+            </w:pPr>
+            <w:r>
+              <w:rPr>
+                <w:rFonts w:ascii="Arial" w:hAnsi="Arial"/>
+                <w:b w:val="0"/>
+                <w:sz w:val="20"/>
+              </w:rPr>
+              <w:t>Structural</w:t>
+            </w:r>
+          </w:p>
+        </w:tc>
+        <w:tc>
+          <w:tcPr>
+            <w:tcW w:type="dxa" w:w="1920"/>
+            <w:vAlign w:val="center"/>
+          </w:tcPr>
+          <w:p>
+            <w:pPr>
+              <w:jc w:val="center"/>
+            </w:pPr>
+            <w:r>
+              <w:rPr>
+                <w:rFonts w:ascii="Arial" w:hAnsi="Arial"/>
+                <w:b w:val="0"/>
+                <w:sz w:val="20"/>
+              </w:rPr>
+              <w:t>High traffic design (MSA &gt; 20.0) but mechanistic verification is missing</w:t>
+            </w:r>
+          </w:p>
+        </w:tc>
+        <w:tc>
+          <w:tcPr>
+            <w:tcW w:type="dxa" w:w="1920"/>
+            <w:vAlign w:val="center"/>
+          </w:tcPr>
+          <w:p>
+            <w:pPr>
+              <w:jc w:val="center"/>
+            </w:pPr>
+            <w:r>
+              <w:rPr>
+                <w:rFonts w:ascii="Arial" w:hAnsi="Arial"/>
+                <w:b w:val="0"/>
+                <w:sz w:val="20"/>
+              </w:rPr>
+              <w:t>Complete IITPAVE mechanistic verification to check critical strains.</w:t>
+            </w:r>
+          </w:p>
+        </w:tc>
+        <w:tc>
+          <w:tcPr>
+            <w:tcW w:type="dxa" w:w="1920"/>
+            <w:vAlign w:val="center"/>
+          </w:tcPr>
+          <w:p>
+            <w:pPr>
+              <w:jc w:val="center"/>
+            </w:pPr>
+            <w:r>
+              <w:rPr>
+                <w:rFonts w:ascii="Arial" w:hAnsi="Arial"/>
+                <w:b w:val="0"/>
+                <w:sz w:val="20"/>
+              </w:rPr>
+              <w:t>IRC:37-2018 mandates mechanistic design validation using IITPAVE for traffic exceeding 20 MSA.</w:t>
+            </w:r>
+          </w:p>
+        </w:tc>
+      </w:tr>
+      <w:tr>
+        <w:tc>
+          <w:tcPr>
+            <w:tcW w:type="dxa" w:w="1920"/>
+            <w:vAlign w:val="center"/>
+          </w:tcPr>
+          <w:p>
+            <w:pPr>
+              <w:jc w:val="left"/>
+            </w:pPr>
+            <w:r>
+              <w:rPr>
+                <w:rFonts w:ascii="Arial" w:hAnsi="Arial"/>
+                <w:b w:val="0"/>
+                <w:sz w:val="20"/>
+              </w:rPr>
+              <w:t>WARNING</w:t>
+            </w:r>
+          </w:p>
+        </w:tc>
+        <w:tc>
+          <w:tcPr>
+            <w:tcW w:type="dxa" w:w="1920"/>
+            <w:vAlign w:val="center"/>
+          </w:tcPr>
+          <w:p>
+            <w:pPr>
+              <w:jc w:val="center"/>
+            </w:pPr>
+            <w:r>
+              <w:rPr>
+                <w:rFonts w:ascii="Arial" w:hAnsi="Arial"/>
+                <w:b w:val="0"/>
+                <w:sz w:val="20"/>
+              </w:rPr>
+              <w:t>Iitpave</w:t>
+            </w:r>
+          </w:p>
+        </w:tc>
+        <w:tc>
+          <w:tcPr>
+            <w:tcW w:type="dxa" w:w="1920"/>
+            <w:vAlign w:val="center"/>
+          </w:tcPr>
+          <w:p>
+            <w:pPr>
+              <w:jc w:val="center"/>
+            </w:pPr>
+            <w:r>
+              <w:rPr>
+                <w:rFonts w:ascii="Arial" w:hAnsi="Arial"/>
+                <w:b w:val="0"/>
+                <w:sz w:val="20"/>
+              </w:rPr>
+              <w:t>Mechanistic Verification Blocked</w:t>
+            </w:r>
+          </w:p>
+        </w:tc>
+        <w:tc>
+          <w:tcPr>
+            <w:tcW w:type="dxa" w:w="1920"/>
+            <w:vAlign w:val="center"/>
+          </w:tcPr>
+          <w:p>
+            <w:pPr>
+              <w:jc w:val="center"/>
+            </w:pPr>
+            <w:r>
+              <w:rPr>
+                <w:rFonts w:ascii="Arial" w:hAnsi="Arial"/>
+                <w:b w:val="0"/>
+                <w:sz w:val="20"/>
+              </w:rPr>
+              <w:t>Ensure a licensed IITPAVE installation is configured to run mechanistic design checks.</w:t>
+            </w:r>
+          </w:p>
+        </w:tc>
+        <w:tc>
+          <w:tcPr>
+            <w:tcW w:type="dxa" w:w="1920"/>
+            <w:vAlign w:val="center"/>
+          </w:tcPr>
+          <w:p>
+            <w:pPr>
+              <w:jc w:val="center"/>
+            </w:pPr>
+            <w:r>
+              <w:rPr>
+                <w:rFonts w:ascii="Arial" w:hAnsi="Arial"/>
+                <w:b w:val="0"/>
+                <w:sz w:val="20"/>
+              </w:rPr>
+              <w:t>Mechanistic verification was not executed because a licensed IITPAVE installation was unavailable.</w:t>
+            </w:r>
+          </w:p>
+        </w:tc>
+      </w:tr>
+      <w:tr>
+        <w:tc>
+          <w:tcPr>
+            <w:tcW w:type="dxa" w:w="1920"/>
+            <w:vAlign w:val="center"/>
+          </w:tcPr>
+          <w:p>
+            <w:pPr>
+              <w:jc w:val="left"/>
+            </w:pPr>
+            <w:r>
+              <w:rPr>
+                <w:rFonts w:ascii="Arial" w:hAnsi="Arial"/>
+                <w:b w:val="0"/>
+                <w:sz w:val="20"/>
+              </w:rPr>
               <w:t>INFO</w:t>
             </w:r>
           </w:p>
@@ -20549,7 +20005,7 @@
                 <w:b w:val="0"/>
                 <w:sz w:val="20"/>
               </w:rPr>
-              <w:t>90/100</w:t>
+              <w:t>60/100</w:t>
             </w:r>
           </w:p>
         </w:tc>
@@ -20608,7 +20064,7 @@
                 <w:b w:val="0"/>
                 <w:sz w:val="20"/>
               </w:rPr>
-              <w:t>YELLOW</w:t>
+              <w:t>RED</w:t>
             </w:r>
           </w:p>
         </w:tc>
@@ -20667,7 +20123,7 @@
                 <w:b w:val="0"/>
                 <w:sz w:val="20"/>
               </w:rPr>
-              <w:t>Needs Engineer Review</w:t>
+              <w:t>Not Ready</w:t>
             </w:r>
           </w:p>
         </w:tc>
@@ -20870,7 +20326,7 @@
                 <w:b w:val="0"/>
                 <w:sz w:val="20"/>
               </w:rPr>
-              <w:t>2026-06-29 13:37:22</w:t>
+              <w:t>2026-06-29 14:20:11</w:t>
             </w:r>
           </w:p>
         </w:tc>

</xml_diff>

<commit_message>
release: final RC5 commercial paperwork cleanup
</commit_message>
<xml_diff>
--- a/release/RoadX_v2.2_Professional/Sample_DPR_Report.docx
+++ b/release/RoadX_v2.2_Professional/Sample_DPR_Report.docx
@@ -6861,7 +6861,7 @@
                 <w:b w:val="0"/>
                 <w:sz w:val="20"/>
               </w:rPr>
-              <w:t>29-Jun-2026 08:50:11</w:t>
+              <w:t>29-Jun-2026 09:49:53</w:t>
             </w:r>
           </w:p>
         </w:tc>
@@ -17941,7 +17941,7 @@
                 <w:b w:val="0"/>
                 <w:sz w:val="20"/>
               </w:rPr>
-              <w:t>2026-06-29 14:20:11</w:t>
+              <w:t>2026-06-29 15:19:53</w:t>
             </w:r>
           </w:p>
         </w:tc>
@@ -20326,7 +20326,7 @@
                 <w:b w:val="0"/>
                 <w:sz w:val="20"/>
               </w:rPr>
-              <w:t>2026-06-29 14:20:11</w:t>
+              <w:t>2026-06-29 15:19:53</w:t>
             </w:r>
           </w:p>
         </w:tc>

</xml_diff>